<commit_message>
docs: connect diagnostic evidence to CPT and SFT rationale
</commit_message>
<xml_diff>
--- a/汇报材料/Step120物流知识优化实验_主线修订版_20260907.docx
+++ b/汇报材料/Step120物流知识优化实验_主线修订版_20260907.docx
@@ -56,7 +56,7 @@
           <w:sz w:val="30"/>
           <w:color w:val="000000"/>
         </w:rPr>
-        <w:t>本报告围绕一条优化路径展开：从基线比较发现提升空间，通过诊断和 CPT 检验知识学习效果，再以书籍问答 SFT 强化知识应用，最后用未做 SFT 的模型对照验证收益。</w:t>
+        <w:t>本报告按五个环节展开：基线比较发现提升空间，条件对照提供根因线索，CPT 检验知识文本学习，书籍问答 SFT 检验作答监督，未做 SFT 的模型对照用于评估收益。</w:t>
       </w:r>
     </w:p>
     <w:p>
@@ -762,7 +762,7 @@
           <w:sz w:val="40"/>
           <w:color w:val="000000"/>
         </w:rPr>
-        <w:t>二 探测 区分知识储备与知识应用</w:t>
+        <w:t>二 探测 获取知识储备与应用线索</w:t>
       </w:r>
     </w:p>
     <w:p>
@@ -781,7 +781,7 @@
           <w:sz w:val="30"/>
           <w:color w:val="000000"/>
         </w:rPr>
-        <w:t>探测回答两个问题：模型是否掌握相关知识，以及能否在具体题目中正确使用知识。固定原始 Step120，设置原题闭卷、原题加教材、基础题闭卷、基础题加教材四种条件，各重复3轮；检索不使用标准答案，基础题与资料质量分别审核。[3]</w:t>
+        <w:t>探测围绕两个问题获取线索：模型是否掌握相关知识，以及能否在原题中使用知识。固定原始 Step120，设置原题闭卷、原题加教材、基础题闭卷、基础题加教材四种条件，各重复3轮；检索不使用标准答案，基础题与资料质量分别审核。[3]</w:t>
       </w:r>
     </w:p>
     <w:tbl>
@@ -1266,7 +1266,7 @@
           <w:sz w:val="30"/>
           <w:color w:val="000000"/>
         </w:rPr>
-        <w:t>基础题表现说明部分相关知识可被调用；加入教材改善了部分错题，但原题作答仍存在差距。进一步的闭卷问答将优化重点指向概念辨析和情景应用，详见附录。[4][5]</w:t>
+        <w:t>基础题闭卷表现支持“部分相关知识可被调用”，不代表全部原题所需知识已经具备。教材改善了部分历史错题，也干扰了部分原答对题，说明资料支持有帮助，但其作用并不一致。[4]</w:t>
       </w:r>
     </w:p>
     <w:p>
@@ -1285,7 +1285,7 @@
           <w:sz w:val="30"/>
           <w:color w:val="000000"/>
         </w:rPr>
-        <w:t>原题与基础题的难度、分母不同，不能直接相减归因。诊断据此形成两条验证路径：用 CPT 检验补充知识文本的收益，用 SFT 检验问答监督的收益。</w:t>
+        <w:t>原题与基础题的样本、难度不同，不能直接比较正确率归因。现有结果尚不能区分：教材补充了缺失知识，还是帮助调用了已有知识。因此进一步开展 CPT，检验把相关知识转入训练后，模型能否在不提供教材时改善作答。</w:t>
       </w:r>
     </w:p>
     <w:p>
@@ -1323,7 +1323,7 @@
           <w:sz w:val="30"/>
           <w:color w:val="000000"/>
         </w:rPr>
-        <w:t>将评测基准转为文本语料，检验显式学习相关知识后能否提高问答得分。直接题面与改写题面两组均从原始 Step120 启动，各训练4遍、64步，再按统一三轮多数票口径评测。[6]</w:t>
+        <w:t>将评测基准转为文本语料，检验相关知识训练能否改善闭卷作答。直接题面与改写题面两组均从原始 Step120 启动，各训练4遍、64步，再按统一三轮多数票口径评测。[6]</w:t>
       </w:r>
     </w:p>
     <w:tbl>
@@ -1953,7 +1953,7 @@
           <w:sz w:val="30"/>
           <w:color w:val="000000"/>
         </w:rPr>
-        <w:t>CPT 后得分小幅提升，训练损失也下降，但文本学习没有充分转化为问答收益。结合第二部分诊断，优化重点从单纯补充知识文本转向知识调用与应用。</w:t>
+        <w:t>CPT 后得分小幅提升，训练损失下降，说明这组文本训练产生了学习效果，但问答收益较小。损失下降不等于知识已充分吸收，该结果仍不能区分知识吸收与调用的影响。</w:t>
       </w:r>
     </w:p>
     <w:p>
@@ -1972,7 +1972,7 @@
           <w:sz w:val="30"/>
           <w:color w:val="000000"/>
         </w:rPr>
-        <w:t>这一结果支持开展问答 SFT，但不足以证明知识完全无缺失。本组使用了评测题及答案，成绩仅用于同题诊断，不代表未见题目的泛化能力。</w:t>
+        <w:t>因此进一步改变监督方式：从学习知识文本，转为直接训练“问题—答案”对应关系，检验问答 SFT 能否增加收益。这里验证的是优化方法，不据此认定知识完全无缺失。本组使用评测题及答案，成绩仅用于同题诊断。</w:t>
       </w:r>
     </w:p>
     <w:p>
@@ -2010,7 +2010,7 @@
           <w:sz w:val="30"/>
           <w:color w:val="000000"/>
         </w:rPr>
-        <w:t>针对知识调用与应用，将采集书籍转为有出处、经复核的问答对，覆盖事实校准、概念辨析、条件判断和情景应用。训练目标是让模型在问题条件下准确组织知识并作答。</w:t>
+        <w:t>CPT 学习知识文本，问答 SFT 直接训练模型根据问题条件组织知识并生成答案。为检验这种监督方式，将采集书籍转为有出处、经复核的问答对，覆盖事实校准、概念辨析、条件判断和情景应用。闭卷诊断为这些训练方向提供线索，详见附录。[5]</w:t>
       </w:r>
     </w:p>
     <w:p>
@@ -2029,7 +2029,7 @@
           <w:sz w:val="30"/>
           <w:color w:val="000000"/>
         </w:rPr>
-        <w:t>训练路线为：原始 Step120 → 书籍原文 CPT → 书籍问答 SFT。SFT 从书籍 CPT 得分最高的四遍模型启动，对应第116步。这里使用的是书籍 CPT 模型，与方案一的评测题 CPT 模型分开。[8]</w:t>
+        <w:t>方案一的评测题 CPT 用于诊断；本方案采用独立书籍数据，训练路线为：原始 Step120 → 书籍原文 CPT → 书籍问答 SFT。SFT 从已测书籍 CPT 中得分最高的四遍模型启动，对应第116步。选择它是统一训练起点，不代表已经证明 CPT 是必要步骤。[8]</w:t>
       </w:r>
     </w:p>
     <w:p>
@@ -2048,7 +2048,7 @@
           <w:sz w:val="30"/>
           <w:color w:val="000000"/>
         </w:rPr>
-        <w:t>SFT 沿用该模型权重，重新初始化优化器与训练日程。问答数据来自独立书籍内容，不使用公开评测答案、错题派生诊断题或定向补证资料。训练起点的候选比较见附录。</w:t>
+        <w:t>SFT 沿用该模型权重，重新初始化优化器与训练日程。问答数据不使用公开评测答案、错题派生诊断题或定向补证资料。书籍 CPT 的候选比较见附录。</w:t>
       </w:r>
     </w:p>
     <w:p>
@@ -2571,7 +2571,7 @@
           <w:sz w:val="30"/>
           <w:color w:val="000000"/>
         </w:rPr>
-        <w:t>三模型采用相同题集、推理配置与评分口径。SC-bench 与 LogistikaBench 作为公开参考集；独立题集用于检验泛化，原有 Agent 与通用能力纳入回归评估。</w:t>
+        <w:t>三模型采用相同题集、推理配置与评分口径。公开基准检验得分变化，独立题集检验泛化，Agent 与通用能力回归检验原有能力是否保持。</w:t>
       </w:r>
     </w:p>
     <w:p>
@@ -3112,6 +3112,538 @@
     </w:tbl>
     <w:p>
       <w:pPr>
+        <w:pStyle w:val="Heading2"/>
+        <w:keepNext/>
+        <w:pageBreakBefore w:val="0"/>
+        <w:widowControl/>
+        <w:spacing w:line="360" w:lineRule="auto" w:before="160" w:after="120"/>
+        <w:ind w:firstLineChars="0" w:firstLine="0"/>
+      </w:pPr>
+      <w:r>
+        <w:rPr>
+          <w:rFonts w:eastAsia="SimHei" w:ascii="Times New Roman" w:hAnsi="Times New Roman"/>
+          <w:b/>
+          <w:sz w:val="32"/>
+          <w:color w:val="000000"/>
+        </w:rPr>
+        <w:t>独立题集与能力回归</w:t>
+      </w:r>
+    </w:p>
+    <w:tbl>
+      <w:tblPr>
+        <w:tblW w:type="auto" w:w="0"/>
+        <w:tblLayout w:type="fixed"/>
+        <w:tblLook w:firstColumn="1" w:firstRow="1" w:lastColumn="0" w:lastRow="0" w:noHBand="0" w:noVBand="1" w:val="04A0"/>
+        <w:tblBorders>
+          <w:top w:val="single" w:sz="4" w:color="D9D9D9"/>
+          <w:left w:val="single" w:sz="4" w:color="D9D9D9"/>
+          <w:bottom w:val="single" w:sz="4" w:color="D9D9D9"/>
+          <w:right w:val="single" w:sz="4" w:color="D9D9D9"/>
+          <w:insideH w:val="single" w:sz="4" w:color="D9D9D9"/>
+          <w:insideV w:val="single" w:sz="4" w:color="D9D9D9"/>
+        </w:tblBorders>
+      </w:tblPr>
+      <w:tblGrid>
+        <w:gridCol w:w="3168"/>
+        <w:gridCol w:w="2016"/>
+        <w:gridCol w:w="1872"/>
+        <w:gridCol w:w="1872"/>
+      </w:tblGrid>
+      <w:tr>
+        <w:trPr>
+          <w:cantSplit/>
+          <w:tblHeader/>
+        </w:trPr>
+        <w:tc>
+          <w:tcPr>
+            <w:tcW w:type="dxa" w:w="3168"/>
+            <w:vAlign w:val="center"/>
+            <w:shd w:fill="E7E6E6"/>
+            <w:tcMar>
+              <w:top w:w="80" w:type="dxa"/>
+              <w:bottom w:w="80" w:type="dxa"/>
+              <w:left w:w="80" w:type="dxa"/>
+              <w:right w:w="80" w:type="dxa"/>
+            </w:tcMar>
+          </w:tcPr>
+          <w:p>
+            <w:pPr>
+              <w:keepNext/>
+              <w:spacing w:line="360" w:lineRule="auto" w:before="60" w:after="60"/>
+              <w:ind w:firstLine="0" w:firstLineChars="0"/>
+              <w:jc w:val="left"/>
+            </w:pPr>
+            <w:r>
+              <w:rPr>
+                <w:rFonts w:ascii="Times New Roman" w:hAnsi="Times New Roman" w:eastAsia="SimSun"/>
+                <w:b/>
+                <w:color w:val="000000"/>
+                <w:sz w:val="30"/>
+              </w:rPr>
+              <w:t>评估项目</w:t>
+            </w:r>
+          </w:p>
+        </w:tc>
+        <w:tc>
+          <w:tcPr>
+            <w:tcW w:type="dxa" w:w="2016"/>
+            <w:vAlign w:val="center"/>
+            <w:shd w:fill="E7E6E6"/>
+            <w:tcMar>
+              <w:top w:w="80" w:type="dxa"/>
+              <w:bottom w:w="80" w:type="dxa"/>
+              <w:left w:w="80" w:type="dxa"/>
+              <w:right w:w="80" w:type="dxa"/>
+            </w:tcMar>
+          </w:tcPr>
+          <w:p>
+            <w:pPr>
+              <w:keepNext/>
+              <w:spacing w:line="360" w:lineRule="auto" w:before="60" w:after="60"/>
+              <w:ind w:firstLine="0" w:firstLineChars="0"/>
+              <w:jc w:val="center"/>
+            </w:pPr>
+            <w:r>
+              <w:rPr>
+                <w:rFonts w:ascii="Times New Roman" w:hAnsi="Times New Roman" w:eastAsia="SimSun"/>
+                <w:b/>
+                <w:color w:val="000000"/>
+                <w:sz w:val="30"/>
+              </w:rPr>
+              <w:t>A 原始 Step120</w:t>
+            </w:r>
+          </w:p>
+        </w:tc>
+        <w:tc>
+          <w:tcPr>
+            <w:tcW w:type="dxa" w:w="1872"/>
+            <w:vAlign w:val="center"/>
+            <w:shd w:fill="E7E6E6"/>
+            <w:tcMar>
+              <w:top w:w="80" w:type="dxa"/>
+              <w:bottom w:w="80" w:type="dxa"/>
+              <w:left w:w="80" w:type="dxa"/>
+              <w:right w:w="80" w:type="dxa"/>
+            </w:tcMar>
+          </w:tcPr>
+          <w:p>
+            <w:pPr>
+              <w:keepNext/>
+              <w:spacing w:line="360" w:lineRule="auto" w:before="60" w:after="60"/>
+              <w:ind w:firstLine="0" w:firstLineChars="0"/>
+              <w:jc w:val="center"/>
+            </w:pPr>
+            <w:r>
+              <w:rPr>
+                <w:rFonts w:ascii="Times New Roman" w:hAnsi="Times New Roman" w:eastAsia="SimSun"/>
+                <w:b/>
+                <w:color w:val="000000"/>
+                <w:sz w:val="30"/>
+              </w:rPr>
+              <w:t>B 书籍 CPT</w:t>
+            </w:r>
+          </w:p>
+        </w:tc>
+        <w:tc>
+          <w:tcPr>
+            <w:tcW w:type="dxa" w:w="1872"/>
+            <w:vAlign w:val="center"/>
+            <w:shd w:fill="E7E6E6"/>
+            <w:tcMar>
+              <w:top w:w="80" w:type="dxa"/>
+              <w:bottom w:w="80" w:type="dxa"/>
+              <w:left w:w="80" w:type="dxa"/>
+              <w:right w:w="80" w:type="dxa"/>
+            </w:tcMar>
+          </w:tcPr>
+          <w:p>
+            <w:pPr>
+              <w:keepNext/>
+              <w:spacing w:line="360" w:lineRule="auto" w:before="60" w:after="60"/>
+              <w:ind w:firstLine="0" w:firstLineChars="0"/>
+              <w:jc w:val="center"/>
+            </w:pPr>
+            <w:r>
+              <w:rPr>
+                <w:rFonts w:ascii="Times New Roman" w:hAnsi="Times New Roman" w:eastAsia="SimSun"/>
+                <w:b/>
+                <w:color w:val="000000"/>
+                <w:sz w:val="30"/>
+              </w:rPr>
+              <w:t>C 书籍 SFT</w:t>
+            </w:r>
+          </w:p>
+        </w:tc>
+      </w:tr>
+      <w:tr>
+        <w:trPr>
+          <w:cantSplit/>
+        </w:trPr>
+        <w:tc>
+          <w:tcPr>
+            <w:tcW w:type="dxa" w:w="3168"/>
+            <w:vAlign w:val="center"/>
+            <w:shd w:fill="FFFFFF"/>
+            <w:tcMar>
+              <w:top w:w="80" w:type="dxa"/>
+              <w:bottom w:w="80" w:type="dxa"/>
+              <w:left w:w="80" w:type="dxa"/>
+              <w:right w:w="80" w:type="dxa"/>
+            </w:tcMar>
+          </w:tcPr>
+          <w:p>
+            <w:pPr>
+              <w:keepNext/>
+              <w:spacing w:line="360" w:lineRule="auto" w:before="60" w:after="60"/>
+              <w:ind w:firstLine="0" w:firstLineChars="0"/>
+              <w:jc w:val="left"/>
+            </w:pPr>
+            <w:r>
+              <w:rPr>
+                <w:rFonts w:ascii="Times New Roman" w:hAnsi="Times New Roman" w:eastAsia="SimSun"/>
+                <w:b w:val="0"/>
+                <w:color w:val="000000"/>
+                <w:sz w:val="30"/>
+              </w:rPr>
+              <w:t>独立问答题集</w:t>
+            </w:r>
+          </w:p>
+        </w:tc>
+        <w:tc>
+          <w:tcPr>
+            <w:tcW w:type="dxa" w:w="2016"/>
+            <w:vAlign w:val="center"/>
+            <w:shd w:fill="FFFFFF"/>
+            <w:tcMar>
+              <w:top w:w="80" w:type="dxa"/>
+              <w:bottom w:w="80" w:type="dxa"/>
+              <w:left w:w="80" w:type="dxa"/>
+              <w:right w:w="80" w:type="dxa"/>
+            </w:tcMar>
+          </w:tcPr>
+          <w:p>
+            <w:pPr>
+              <w:keepNext/>
+              <w:spacing w:line="360" w:lineRule="auto" w:before="60" w:after="60"/>
+              <w:ind w:firstLine="0" w:firstLineChars="0"/>
+              <w:jc w:val="center"/>
+            </w:pPr>
+            <w:r>
+              <w:rPr>
+                <w:rFonts w:ascii="Times New Roman" w:hAnsi="Times New Roman" w:eastAsia="SimSun"/>
+                <w:b w:val="0"/>
+                <w:color w:val="000000"/>
+                <w:sz w:val="30"/>
+              </w:rPr>
+            </w:r>
+          </w:p>
+        </w:tc>
+        <w:tc>
+          <w:tcPr>
+            <w:tcW w:type="dxa" w:w="1872"/>
+            <w:vAlign w:val="center"/>
+            <w:shd w:fill="FFFFFF"/>
+            <w:tcMar>
+              <w:top w:w="80" w:type="dxa"/>
+              <w:bottom w:w="80" w:type="dxa"/>
+              <w:left w:w="80" w:type="dxa"/>
+              <w:right w:w="80" w:type="dxa"/>
+            </w:tcMar>
+          </w:tcPr>
+          <w:p>
+            <w:pPr>
+              <w:keepNext/>
+              <w:spacing w:line="360" w:lineRule="auto" w:before="60" w:after="60"/>
+              <w:ind w:firstLine="0" w:firstLineChars="0"/>
+              <w:jc w:val="center"/>
+            </w:pPr>
+            <w:r>
+              <w:rPr>
+                <w:rFonts w:ascii="Times New Roman" w:hAnsi="Times New Roman" w:eastAsia="SimSun"/>
+                <w:b w:val="0"/>
+                <w:color w:val="000000"/>
+                <w:sz w:val="30"/>
+              </w:rPr>
+            </w:r>
+          </w:p>
+        </w:tc>
+        <w:tc>
+          <w:tcPr>
+            <w:tcW w:type="dxa" w:w="1872"/>
+            <w:vAlign w:val="center"/>
+            <w:shd w:fill="FFFFFF"/>
+            <w:tcMar>
+              <w:top w:w="80" w:type="dxa"/>
+              <w:bottom w:w="80" w:type="dxa"/>
+              <w:left w:w="80" w:type="dxa"/>
+              <w:right w:w="80" w:type="dxa"/>
+            </w:tcMar>
+          </w:tcPr>
+          <w:p>
+            <w:pPr>
+              <w:keepNext/>
+              <w:spacing w:line="360" w:lineRule="auto" w:before="60" w:after="60"/>
+              <w:ind w:firstLine="0" w:firstLineChars="0"/>
+              <w:jc w:val="center"/>
+            </w:pPr>
+            <w:r>
+              <w:rPr>
+                <w:rFonts w:ascii="Times New Roman" w:hAnsi="Times New Roman" w:eastAsia="SimSun"/>
+                <w:b w:val="0"/>
+                <w:color w:val="000000"/>
+                <w:sz w:val="30"/>
+              </w:rPr>
+            </w:r>
+          </w:p>
+        </w:tc>
+      </w:tr>
+      <w:tr>
+        <w:trPr>
+          <w:cantSplit/>
+        </w:trPr>
+        <w:tc>
+          <w:tcPr>
+            <w:tcW w:type="dxa" w:w="3168"/>
+            <w:vAlign w:val="center"/>
+            <w:shd w:fill="FFFFFF"/>
+            <w:tcMar>
+              <w:top w:w="80" w:type="dxa"/>
+              <w:bottom w:w="80" w:type="dxa"/>
+              <w:left w:w="80" w:type="dxa"/>
+              <w:right w:w="80" w:type="dxa"/>
+            </w:tcMar>
+          </w:tcPr>
+          <w:p>
+            <w:pPr>
+              <w:keepNext/>
+              <w:spacing w:line="360" w:lineRule="auto" w:before="60" w:after="60"/>
+              <w:ind w:firstLine="0" w:firstLineChars="0"/>
+              <w:jc w:val="left"/>
+            </w:pPr>
+            <w:r>
+              <w:rPr>
+                <w:rFonts w:ascii="Times New Roman" w:hAnsi="Times New Roman" w:eastAsia="SimSun"/>
+                <w:b w:val="0"/>
+                <w:color w:val="000000"/>
+                <w:sz w:val="30"/>
+              </w:rPr>
+              <w:t>原有 Agent 能力</w:t>
+            </w:r>
+          </w:p>
+        </w:tc>
+        <w:tc>
+          <w:tcPr>
+            <w:tcW w:type="dxa" w:w="2016"/>
+            <w:vAlign w:val="center"/>
+            <w:shd w:fill="FFFFFF"/>
+            <w:tcMar>
+              <w:top w:w="80" w:type="dxa"/>
+              <w:bottom w:w="80" w:type="dxa"/>
+              <w:left w:w="80" w:type="dxa"/>
+              <w:right w:w="80" w:type="dxa"/>
+            </w:tcMar>
+          </w:tcPr>
+          <w:p>
+            <w:pPr>
+              <w:keepNext/>
+              <w:spacing w:line="360" w:lineRule="auto" w:before="60" w:after="60"/>
+              <w:ind w:firstLine="0" w:firstLineChars="0"/>
+              <w:jc w:val="center"/>
+            </w:pPr>
+            <w:r>
+              <w:rPr>
+                <w:rFonts w:ascii="Times New Roman" w:hAnsi="Times New Roman" w:eastAsia="SimSun"/>
+                <w:b w:val="0"/>
+                <w:color w:val="000000"/>
+                <w:sz w:val="30"/>
+              </w:rPr>
+            </w:r>
+          </w:p>
+        </w:tc>
+        <w:tc>
+          <w:tcPr>
+            <w:tcW w:type="dxa" w:w="1872"/>
+            <w:vAlign w:val="center"/>
+            <w:shd w:fill="FFFFFF"/>
+            <w:tcMar>
+              <w:top w:w="80" w:type="dxa"/>
+              <w:bottom w:w="80" w:type="dxa"/>
+              <w:left w:w="80" w:type="dxa"/>
+              <w:right w:w="80" w:type="dxa"/>
+            </w:tcMar>
+          </w:tcPr>
+          <w:p>
+            <w:pPr>
+              <w:keepNext/>
+              <w:spacing w:line="360" w:lineRule="auto" w:before="60" w:after="60"/>
+              <w:ind w:firstLine="0" w:firstLineChars="0"/>
+              <w:jc w:val="center"/>
+            </w:pPr>
+            <w:r>
+              <w:rPr>
+                <w:rFonts w:ascii="Times New Roman" w:hAnsi="Times New Roman" w:eastAsia="SimSun"/>
+                <w:b w:val="0"/>
+                <w:color w:val="000000"/>
+                <w:sz w:val="30"/>
+              </w:rPr>
+            </w:r>
+          </w:p>
+        </w:tc>
+        <w:tc>
+          <w:tcPr>
+            <w:tcW w:type="dxa" w:w="1872"/>
+            <w:vAlign w:val="center"/>
+            <w:shd w:fill="FFFFFF"/>
+            <w:tcMar>
+              <w:top w:w="80" w:type="dxa"/>
+              <w:bottom w:w="80" w:type="dxa"/>
+              <w:left w:w="80" w:type="dxa"/>
+              <w:right w:w="80" w:type="dxa"/>
+            </w:tcMar>
+          </w:tcPr>
+          <w:p>
+            <w:pPr>
+              <w:keepNext/>
+              <w:spacing w:line="360" w:lineRule="auto" w:before="60" w:after="60"/>
+              <w:ind w:firstLine="0" w:firstLineChars="0"/>
+              <w:jc w:val="center"/>
+            </w:pPr>
+            <w:r>
+              <w:rPr>
+                <w:rFonts w:ascii="Times New Roman" w:hAnsi="Times New Roman" w:eastAsia="SimSun"/>
+                <w:b w:val="0"/>
+                <w:color w:val="000000"/>
+                <w:sz w:val="30"/>
+              </w:rPr>
+            </w:r>
+          </w:p>
+        </w:tc>
+      </w:tr>
+      <w:tr>
+        <w:trPr>
+          <w:cantSplit/>
+        </w:trPr>
+        <w:tc>
+          <w:tcPr>
+            <w:tcW w:type="dxa" w:w="3168"/>
+            <w:vAlign w:val="center"/>
+            <w:shd w:fill="FFFFFF"/>
+            <w:tcMar>
+              <w:top w:w="80" w:type="dxa"/>
+              <w:bottom w:w="80" w:type="dxa"/>
+              <w:left w:w="80" w:type="dxa"/>
+              <w:right w:w="80" w:type="dxa"/>
+            </w:tcMar>
+          </w:tcPr>
+          <w:p>
+            <w:pPr>
+              <w:keepNext w:val="0"/>
+              <w:spacing w:line="360" w:lineRule="auto" w:before="60" w:after="60"/>
+              <w:ind w:firstLine="0" w:firstLineChars="0"/>
+              <w:jc w:val="left"/>
+            </w:pPr>
+            <w:r>
+              <w:rPr>
+                <w:rFonts w:ascii="Times New Roman" w:hAnsi="Times New Roman" w:eastAsia="SimSun"/>
+                <w:b w:val="0"/>
+                <w:color w:val="000000"/>
+                <w:sz w:val="30"/>
+              </w:rPr>
+              <w:t>通用能力</w:t>
+            </w:r>
+          </w:p>
+        </w:tc>
+        <w:tc>
+          <w:tcPr>
+            <w:tcW w:type="dxa" w:w="2016"/>
+            <w:vAlign w:val="center"/>
+            <w:shd w:fill="FFFFFF"/>
+            <w:tcMar>
+              <w:top w:w="80" w:type="dxa"/>
+              <w:bottom w:w="80" w:type="dxa"/>
+              <w:left w:w="80" w:type="dxa"/>
+              <w:right w:w="80" w:type="dxa"/>
+            </w:tcMar>
+          </w:tcPr>
+          <w:p>
+            <w:pPr>
+              <w:keepNext w:val="0"/>
+              <w:spacing w:line="360" w:lineRule="auto" w:before="60" w:after="60"/>
+              <w:ind w:firstLine="0" w:firstLineChars="0"/>
+              <w:jc w:val="center"/>
+            </w:pPr>
+            <w:r>
+              <w:rPr>
+                <w:rFonts w:ascii="Times New Roman" w:hAnsi="Times New Roman" w:eastAsia="SimSun"/>
+                <w:b w:val="0"/>
+                <w:color w:val="000000"/>
+                <w:sz w:val="30"/>
+              </w:rPr>
+            </w:r>
+          </w:p>
+        </w:tc>
+        <w:tc>
+          <w:tcPr>
+            <w:tcW w:type="dxa" w:w="1872"/>
+            <w:vAlign w:val="center"/>
+            <w:shd w:fill="FFFFFF"/>
+            <w:tcMar>
+              <w:top w:w="80" w:type="dxa"/>
+              <w:bottom w:w="80" w:type="dxa"/>
+              <w:left w:w="80" w:type="dxa"/>
+              <w:right w:w="80" w:type="dxa"/>
+            </w:tcMar>
+          </w:tcPr>
+          <w:p>
+            <w:pPr>
+              <w:keepNext w:val="0"/>
+              <w:spacing w:line="360" w:lineRule="auto" w:before="60" w:after="60"/>
+              <w:ind w:firstLine="0" w:firstLineChars="0"/>
+              <w:jc w:val="center"/>
+            </w:pPr>
+            <w:r>
+              <w:rPr>
+                <w:rFonts w:ascii="Times New Roman" w:hAnsi="Times New Roman" w:eastAsia="SimSun"/>
+                <w:b w:val="0"/>
+                <w:color w:val="000000"/>
+                <w:sz w:val="30"/>
+              </w:rPr>
+            </w:r>
+          </w:p>
+        </w:tc>
+        <w:tc>
+          <w:tcPr>
+            <w:tcW w:type="dxa" w:w="1872"/>
+            <w:vAlign w:val="center"/>
+            <w:shd w:fill="FFFFFF"/>
+            <w:tcMar>
+              <w:top w:w="80" w:type="dxa"/>
+              <w:bottom w:w="80" w:type="dxa"/>
+              <w:left w:w="80" w:type="dxa"/>
+              <w:right w:w="80" w:type="dxa"/>
+            </w:tcMar>
+          </w:tcPr>
+          <w:p>
+            <w:pPr>
+              <w:keepNext w:val="0"/>
+              <w:spacing w:line="360" w:lineRule="auto" w:before="60" w:after="60"/>
+              <w:ind w:firstLine="0" w:firstLineChars="0"/>
+              <w:jc w:val="center"/>
+            </w:pPr>
+            <w:r>
+              <w:rPr>
+                <w:rFonts w:ascii="Times New Roman" w:hAnsi="Times New Roman" w:eastAsia="SimSun"/>
+                <w:b w:val="0"/>
+                <w:color w:val="000000"/>
+                <w:sz w:val="30"/>
+              </w:rPr>
+            </w:r>
+          </w:p>
+        </w:tc>
+      </w:tr>
+    </w:tbl>
+    <w:p>
+      <w:pPr>
         <w:keepNext w:val="0"/>
         <w:pageBreakBefore w:val="0"/>
         <w:widowControl/>
@@ -3126,7 +3658,7 @@
           <w:sz w:val="30"/>
           <w:color w:val="000000"/>
         </w:rPr>
-        <w:t>以 C 相对 B 的变化衡量 SFT 增量，以 C 相对 A 的变化衡量总收益。本组回答“SFT 是否带来提升”；未设置 Step120 直接 SFT 对照，不据此判断 CPT 是否为必要步骤。</w:t>
+        <w:t>C 相对 B 的变化衡量追加 SFT 的收益，C 相对 A 的变化衡量整条路线收益；同时结合独立题集和原有能力回归判断。未设置 Step120 直接 SFT 对照，因此不判断 CPT 是否必要或是否优于直接 SFT。</w:t>
       </w:r>
     </w:p>
     <w:p>

</xml_diff>